<commit_message>
Update Paper _ HHO _ Gravity _ Roozbahany.docx
</commit_message>
<xml_diff>
--- a/Documents/Paper _ HHO _ Gravity _ Roozbahany.docx
+++ b/Documents/Paper _ HHO _ Gravity _ Roozbahany.docx
@@ -1811,10 +1811,8 @@
         <w:ind w:left="0"/>
         <w:rPr>
           <w:b/>
-          <w:bCs/>
-          <w:sz w:val="28"/>
-          <w:szCs w:val="30"/>
-          <w:rtl/>
+          <w:spacing w:val="-1"/>
+          <w:sz w:val="22"/>
         </w:rPr>
       </w:pPr>
       <w:r>
@@ -1833,51 +1831,64 @@
           <w:sz w:val="28"/>
           <w:szCs w:val="30"/>
         </w:rPr>
-        <w:t xml:space="preserve"> …</w:t>
-      </w:r>
-    </w:p>
-    <w:p>
-      <w:pPr>
-        <w:pStyle w:val="a1"/>
-        <w:ind w:left="0"/>
-        <w:rPr>
-          <w:rtl/>
-        </w:rPr>
-      </w:pPr>
-    </w:p>
-    <w:p>
-      <w:pPr>
-        <w:bidi w:val="0"/>
-        <w:spacing w:line="199" w:lineRule="exact"/>
-        <w:jc w:val="center"/>
-        <w:rPr>
-          <w:rFonts w:asciiTheme="majorBidi" w:hAnsiTheme="majorBidi" w:cstheme="majorBidi"/>
-          <w:b/>
-          <w:sz w:val="22"/>
-        </w:rPr>
-      </w:pPr>
-      <w:r>
-        <w:rPr>
-          <w:rFonts w:asciiTheme="majorBidi" w:hAnsiTheme="majorBidi" w:cstheme="majorBidi"/>
+        <w:t xml:space="preserve"> </w:t>
+      </w:r>
+      <w:r>
+        <w:rPr>
           <w:b/>
           <w:bCs/>
           <w:sz w:val="28"/>
-          <w:szCs w:val="28"/>
-        </w:rPr>
-        <w:t>Nonlinear Inversion of Gravity Anomaly Data for Estimating Buried Sphere Parameters Using Harris Hawks Optimization (HHO)</w:t>
-      </w:r>
-    </w:p>
-    <w:p>
-      <w:pPr>
-        <w:bidi w:val="0"/>
-        <w:spacing w:line="199" w:lineRule="exact"/>
-        <w:jc w:val="center"/>
+          <w:szCs w:val="30"/>
+        </w:rPr>
+        <w:t>Data</w:t>
+      </w:r>
+      <w:r>
         <w:rPr>
           <w:b/>
-          <w:spacing w:val="-1"/>
-          <w:sz w:val="22"/>
-        </w:rPr>
-      </w:pPr>
+          <w:bCs/>
+          <w:sz w:val="28"/>
+          <w:szCs w:val="30"/>
+        </w:rPr>
+        <w:t xml:space="preserve"> for </w:t>
+      </w:r>
+      <w:proofErr w:type="spellStart"/>
+      <w:r>
+        <w:rPr>
+          <w:b/>
+          <w:bCs/>
+          <w:sz w:val="28"/>
+          <w:szCs w:val="30"/>
+        </w:rPr>
+        <w:t>Estmating</w:t>
+      </w:r>
+      <w:proofErr w:type="spellEnd"/>
+      <w:r>
+        <w:rPr>
+          <w:b/>
+          <w:bCs/>
+          <w:sz w:val="28"/>
+          <w:szCs w:val="30"/>
+        </w:rPr>
+        <w:t xml:space="preserve"> Buried Sphere </w:t>
+      </w:r>
+      <w:r>
+        <w:rPr>
+          <w:b/>
+          <w:bCs/>
+          <w:sz w:val="28"/>
+          <w:szCs w:val="30"/>
+        </w:rPr>
+        <w:t>Paramete</w:t>
+      </w:r>
+      <w:r>
+        <w:rPr>
+          <w:b/>
+          <w:bCs/>
+          <w:sz w:val="28"/>
+          <w:szCs w:val="30"/>
+        </w:rPr>
+        <w:t>rs Using Harris Hawks Optimization (HHO)</w:t>
+      </w:r>
     </w:p>
     <w:p>
       <w:pPr>
@@ -2305,108 +2316,108 @@
           <w:rtl/>
           <w:lang w:bidi="fa-IR"/>
         </w:rPr>
+        <w:t xml:space="preserve"> چگالی) از روی میدان ناهنجاری، نقشی بنیادین در ژئوفیزیک اکتشافی دارد [1, 2]. مدل «کره مدفون» به دلیل تقارن شعاعی و تطابق ساختاری بالا با توده‌های متمرکز، به عنوان مدل مرجع در ارزیابی روش‌های وارون‌سازی به کار می‌رود [4]. با این وجود، وارون‌سازی داده‌های گرانی‌سنجی به دلیل ادغام فضایی میدان پتانسیل، </w:t>
+      </w:r>
+      <w:proofErr w:type="spellStart"/>
+      <w:r>
+        <w:rPr>
+          <w:rtl/>
+          <w:lang w:bidi="fa-IR"/>
+        </w:rPr>
+        <w:t>مسئله‌ای</w:t>
+      </w:r>
+      <w:proofErr w:type="spellEnd"/>
+      <w:r>
+        <w:rPr>
+          <w:rtl/>
+          <w:lang w:bidi="fa-IR"/>
+        </w:rPr>
         <w:t xml:space="preserve"> </w:t>
       </w:r>
+      <w:proofErr w:type="spellStart"/>
+      <w:r>
+        <w:rPr>
+          <w:rtl/>
+          <w:lang w:bidi="fa-IR"/>
+        </w:rPr>
+        <w:t>غیرخطی</w:t>
+      </w:r>
+      <w:proofErr w:type="spellEnd"/>
+      <w:r>
+        <w:rPr>
+          <w:rtl/>
+          <w:lang w:bidi="fa-IR"/>
+        </w:rPr>
+        <w:t xml:space="preserve"> و ذاتاً </w:t>
+      </w:r>
+      <w:proofErr w:type="spellStart"/>
+      <w:r>
+        <w:rPr>
+          <w:rtl/>
+          <w:lang w:bidi="fa-IR"/>
+        </w:rPr>
+        <w:t>بدنهاد</w:t>
+      </w:r>
+      <w:proofErr w:type="spellEnd"/>
+      <w:r>
+        <w:rPr>
+          <w:rtl/>
+          <w:lang w:bidi="fa-IR"/>
+        </w:rPr>
+        <w:t xml:space="preserve"> (</w:t>
+      </w:r>
+      <w:r>
+        <w:rPr>
+          <w:lang w:bidi="fa-IR"/>
+        </w:rPr>
+        <w:t>Ill-posed</w:t>
+      </w:r>
+      <w:r>
+        <w:rPr>
+          <w:rtl/>
+          <w:lang w:bidi="fa-IR"/>
+        </w:rPr>
+        <w:t xml:space="preserve">) است که با چالش </w:t>
+      </w:r>
+      <w:proofErr w:type="spellStart"/>
+      <w:r>
+        <w:rPr>
+          <w:rtl/>
+          <w:lang w:bidi="fa-IR"/>
+        </w:rPr>
+        <w:t>چندپاسخی</w:t>
+      </w:r>
+      <w:proofErr w:type="spellEnd"/>
+      <w:r>
+        <w:rPr>
+          <w:rtl/>
+          <w:lang w:bidi="fa-IR"/>
+        </w:rPr>
+        <w:t xml:space="preserve"> و عدم </w:t>
+      </w:r>
+      <w:proofErr w:type="spellStart"/>
+      <w:r>
+        <w:rPr>
+          <w:rtl/>
+          <w:lang w:bidi="fa-IR"/>
+        </w:rPr>
+        <w:t>یکتایی</w:t>
+      </w:r>
+      <w:proofErr w:type="spellEnd"/>
+      <w:r>
+        <w:rPr>
+          <w:rtl/>
+          <w:lang w:bidi="fa-IR"/>
+        </w:rPr>
+        <w:t xml:space="preserve"> شدید مواجه می‌باشد </w:t>
+      </w:r>
       <w:r>
         <w:rPr>
           <w:rtl/>
           <w:lang w:bidi="fa-IR"/>
         </w:rPr>
         <w:lastRenderedPageBreak/>
-        <w:t xml:space="preserve">چگالی) از روی میدان ناهنجاری، نقشی بنیادین در ژئوفیزیک اکتشافی دارد [1, 2]. مدل «کره مدفون» به دلیل تقارن شعاعی و تطابق ساختاری بالا با توده‌های متمرکز، به عنوان مدل مرجع در ارزیابی روش‌های وارون‌سازی به کار می‌رود [4]. با این وجود، وارون‌سازی داده‌های گرانی‌سنجی به دلیل ادغام فضایی میدان پتانسیل، </w:t>
-      </w:r>
-      <w:proofErr w:type="spellStart"/>
-      <w:r>
-        <w:rPr>
-          <w:rtl/>
-          <w:lang w:bidi="fa-IR"/>
-        </w:rPr>
-        <w:t>مسئله‌ای</w:t>
-      </w:r>
-      <w:proofErr w:type="spellEnd"/>
-      <w:r>
-        <w:rPr>
-          <w:rtl/>
-          <w:lang w:bidi="fa-IR"/>
-        </w:rPr>
-        <w:t xml:space="preserve"> </w:t>
-      </w:r>
-      <w:proofErr w:type="spellStart"/>
-      <w:r>
-        <w:rPr>
-          <w:rtl/>
-          <w:lang w:bidi="fa-IR"/>
-        </w:rPr>
-        <w:t>غیرخطی</w:t>
-      </w:r>
-      <w:proofErr w:type="spellEnd"/>
-      <w:r>
-        <w:rPr>
-          <w:rtl/>
-          <w:lang w:bidi="fa-IR"/>
-        </w:rPr>
-        <w:t xml:space="preserve"> و ذاتاً </w:t>
-      </w:r>
-      <w:proofErr w:type="spellStart"/>
-      <w:r>
-        <w:rPr>
-          <w:rtl/>
-          <w:lang w:bidi="fa-IR"/>
-        </w:rPr>
-        <w:t>بدنهاد</w:t>
-      </w:r>
-      <w:proofErr w:type="spellEnd"/>
-      <w:r>
-        <w:rPr>
-          <w:rtl/>
-          <w:lang w:bidi="fa-IR"/>
-        </w:rPr>
-        <w:t xml:space="preserve"> (</w:t>
-      </w:r>
-      <w:r>
-        <w:rPr>
-          <w:lang w:bidi="fa-IR"/>
-        </w:rPr>
-        <w:t>Ill-posed</w:t>
-      </w:r>
-      <w:r>
-        <w:rPr>
-          <w:rtl/>
-          <w:lang w:bidi="fa-IR"/>
-        </w:rPr>
-        <w:t xml:space="preserve">) است که با چالش </w:t>
-      </w:r>
-      <w:proofErr w:type="spellStart"/>
-      <w:r>
-        <w:rPr>
-          <w:rtl/>
-          <w:lang w:bidi="fa-IR"/>
-        </w:rPr>
-        <w:t>چندپاسخی</w:t>
-      </w:r>
-      <w:proofErr w:type="spellEnd"/>
-      <w:r>
-        <w:rPr>
-          <w:rtl/>
-          <w:lang w:bidi="fa-IR"/>
-        </w:rPr>
-        <w:t xml:space="preserve"> و عدم </w:t>
-      </w:r>
-      <w:proofErr w:type="spellStart"/>
-      <w:r>
-        <w:rPr>
-          <w:rtl/>
-          <w:lang w:bidi="fa-IR"/>
-        </w:rPr>
-        <w:t>یکتایی</w:t>
-      </w:r>
-      <w:proofErr w:type="spellEnd"/>
-      <w:r>
-        <w:rPr>
-          <w:rtl/>
-          <w:lang w:bidi="fa-IR"/>
-        </w:rPr>
-        <w:t xml:space="preserve"> شدید مواجه می‌باشد [5]. </w:t>
+        <w:t xml:space="preserve">[5]. </w:t>
       </w:r>
       <w:proofErr w:type="spellStart"/>
       <w:r>
@@ -6037,7 +6048,6 @@
           <w:szCs w:val="24"/>
           <w:rtl/>
         </w:rPr>
-        <w:lastRenderedPageBreak/>
         <w:t>۲-۲. فرمول‌بندی تابع هدف وارون‌سازی</w:t>
       </w:r>
     </w:p>
@@ -6063,6 +6073,7 @@
           <w:rtl/>
           <w:lang w:bidi="fa-IR"/>
         </w:rPr>
+        <w:lastRenderedPageBreak/>
         <w:t xml:space="preserve">     </w:t>
       </w:r>
       <w:r>
@@ -6652,15 +6663,7 @@
                                   <w:szCs w:val="22"/>
                                   <w:lang w:bidi="fa-IR"/>
                                 </w:rPr>
-                                <m:t>i</m:t>
-                              </m:r>
-                              <m:r>
-                                <w:rPr>
-                                  <w:rFonts w:ascii="Cambria Math" w:hAnsi="Cambria Math"/>
-                                  <w:szCs w:val="22"/>
-                                  <w:lang w:bidi="fa-IR"/>
-                                </w:rPr>
-                                <m:t>=1</m:t>
+                                <m:t>i=1</m:t>
                               </m:r>
                             </m:sub>
                             <m:sup>
@@ -8113,18 +8116,7 @@
                                         <w:szCs w:val="22"/>
                                         <w:lang w:bidi="fa-IR"/>
                                       </w:rPr>
-                                      <m:t>-</m:t>
-                                    </m:r>
-                                    <m:r>
-                                      <m:rPr>
-                                        <m:sty m:val="p"/>
-                                      </m:rPr>
-                                      <w:rPr>
-                                        <w:rFonts w:ascii="Cambria Math" w:hAnsi="Cambria Math"/>
-                                        <w:szCs w:val="22"/>
-                                        <w:lang w:bidi="fa-IR"/>
-                                      </w:rPr>
-                                      <m:t>2</m:t>
+                                      <m:t>-2</m:t>
                                     </m:r>
                                     <m:sSub>
                                       <m:sSubPr>
@@ -9231,7 +9223,7 @@
             <m:ctrlPr>
               <w:rPr>
                 <w:rFonts w:ascii="Cambria Math" w:hAnsi="Cambria Math"/>
-                <w:bCs w:val="0"/>
+                <w:b/>
                 <w:sz w:val="20"/>
                 <w:szCs w:val="22"/>
                 <w:lang w:bidi="fa-IR"/>
@@ -9240,6 +9232,9 @@
           </m:sSubPr>
           <m:e>
             <m:r>
+              <m:rPr>
+                <m:sty m:val="bi"/>
+              </m:rPr>
               <w:rPr>
                 <w:rFonts w:ascii="Cambria Math" w:hAnsi="Cambria Math"/>
                 <w:sz w:val="20"/>
@@ -9251,6 +9246,9 @@
           </m:e>
           <m:sub>
             <m:r>
+              <m:rPr>
+                <m:sty m:val="bi"/>
+              </m:rPr>
               <w:rPr>
                 <w:rFonts w:ascii="Cambria Math" w:hAnsi="Cambria Math"/>
                 <w:sz w:val="20"/>
@@ -9266,7 +9264,7 @@
             <m:ctrlPr>
               <w:rPr>
                 <w:rFonts w:ascii="Cambria Math" w:hAnsi="Cambria Math"/>
-                <w:bCs w:val="0"/>
+                <w:b/>
                 <w:sz w:val="20"/>
                 <w:szCs w:val="22"/>
                 <w:lang w:bidi="fa-IR"/>
@@ -9275,6 +9273,9 @@
           </m:dPr>
           <m:e>
             <m:r>
+              <m:rPr>
+                <m:sty m:val="bi"/>
+              </m:rPr>
               <w:rPr>
                 <w:rFonts w:ascii="Cambria Math" w:hAnsi="Cambria Math"/>
                 <w:sz w:val="20"/>
@@ -18684,18 +18685,7 @@
                     <w:sz w:val="20"/>
                     <w:lang w:bidi="fa-IR"/>
                   </w:rPr>
-                  <m:t>±</m:t>
-                </m:r>
-                <m:r>
-                  <m:rPr>
-                    <m:sty m:val="bi"/>
-                  </m:rPr>
-                  <w:rPr>
-                    <w:rFonts w:ascii="Cambria Math" w:hAnsi="Cambria Math"/>
-                    <w:sz w:val="20"/>
-                    <w:lang w:bidi="fa-IR"/>
-                  </w:rPr>
-                  <m:t>σ</m:t>
+                  <m:t>±σ</m:t>
                 </m:r>
                 <m:r>
                   <m:rPr>
@@ -19873,7 +19863,7 @@
           <w:rtl/>
           <w:lang w:bidi="fa-IR"/>
         </w:rPr>
-        <w:t xml:space="preserve"> تطابق داده‌های برآوردی با </w:t>
+        <w:t xml:space="preserve"> تطابق </w:t>
       </w:r>
       <w:proofErr w:type="spellStart"/>
       <w:r>
@@ -19889,6 +19879,22 @@
           <w:rtl/>
           <w:lang w:bidi="fa-IR"/>
         </w:rPr>
+        <w:t xml:space="preserve"> برآوردی با </w:t>
+      </w:r>
+      <w:proofErr w:type="spellStart"/>
+      <w:r>
+        <w:rPr>
+          <w:rtl/>
+          <w:lang w:bidi="fa-IR"/>
+        </w:rPr>
+        <w:t>داده‌های</w:t>
+      </w:r>
+      <w:proofErr w:type="spellEnd"/>
+      <w:r>
+        <w:rPr>
+          <w:rtl/>
+          <w:lang w:bidi="fa-IR"/>
+        </w:rPr>
         <w:t xml:space="preserve"> </w:t>
       </w:r>
       <w:proofErr w:type="spellStart"/>
@@ -19969,7 +19975,23 @@
           <w:rtl/>
           <w:lang w:bidi="fa-IR"/>
         </w:rPr>
-        <w:t xml:space="preserve"> می‌شوند، ساختار </w:t>
+        <w:t xml:space="preserve"> </w:t>
+      </w:r>
+      <w:proofErr w:type="spellStart"/>
+      <w:r>
+        <w:rPr>
+          <w:rtl/>
+          <w:lang w:bidi="fa-IR"/>
+        </w:rPr>
+        <w:t>می‌شوند</w:t>
+      </w:r>
+      <w:proofErr w:type="spellEnd"/>
+      <w:r>
+        <w:rPr>
+          <w:rtl/>
+          <w:lang w:bidi="fa-IR"/>
+        </w:rPr>
+        <w:t xml:space="preserve">، ساختار </w:t>
       </w:r>
       <w:proofErr w:type="spellStart"/>
       <w:r>
@@ -20609,7 +20631,23 @@
           <w:rtl/>
           <w:lang w:bidi="fa-IR"/>
         </w:rPr>
-        <w:t xml:space="preserve"> است؛ در داده‌های واقعی، عدم حذف دقیق اثرات </w:t>
+        <w:t xml:space="preserve"> است؛ در </w:t>
+      </w:r>
+      <w:proofErr w:type="spellStart"/>
+      <w:r>
+        <w:rPr>
+          <w:rtl/>
+          <w:lang w:bidi="fa-IR"/>
+        </w:rPr>
+        <w:t>داده‌های</w:t>
+      </w:r>
+      <w:proofErr w:type="spellEnd"/>
+      <w:r>
+        <w:rPr>
+          <w:rtl/>
+          <w:lang w:bidi="fa-IR"/>
+        </w:rPr>
+        <w:t xml:space="preserve"> واقعی، عدم حذف دقیق اثرات </w:t>
       </w:r>
       <w:proofErr w:type="spellStart"/>
       <w:r>

</xml_diff>